<commit_message>
Guía interna actualizada con las cuentas de participante
Co-Authored-By: Claude Opus 5.5 <noreply@anthropic.com>
</commit_message>
<xml_diff>
--- a/docs/Guia_Interna_Equipo.docx
+++ b/docs/Guia_Interna_Equipo.docx
@@ -1436,7 +1436,7 @@
                 <w:sz w:val="22"/>
                 <w:szCs w:val="22"/>
               </w:rPr>
-              <w:t xml:space="preserve">Botón "Registrarme": llena nombre, alias, correo y consentimiento. Queda registrado en ese navegador.</w:t>
+              <w:t xml:space="preserve">Botón "Crear cuenta" (nombre, alias, correo, contraseña y consentimiento). Después entra desde cualquier dispositivo con "Ingresar".</w:t>
             </w:r>
           </w:p>
         </w:tc>
@@ -1469,7 +1469,7 @@
                 <w:sz w:val="22"/>
                 <w:szCs w:val="22"/>
               </w:rPr>
-              <w:t xml:space="preserve">No. Es una sesión anónima</w:t>
+              <w:t xml:space="preserve">Sí, la elige al crear su cuenta</w:t>
             </w:r>
           </w:p>
         </w:tc>
@@ -1593,7 +1593,7 @@
           <w:sz w:val="25"/>
           <w:szCs w:val="25"/>
         </w:rPr>
-        <w:t xml:space="preserve">2.1 ¿"Registrarme" crea una cuenta?</w:t>
+        <w:t xml:space="preserve">2.1 Las cuentas de participante</w:t>
       </w:r>
     </w:p>
     <w:p>
@@ -1608,7 +1608,7 @@
           <w:sz w:val="22"/>
           <w:szCs w:val="22"/>
         </w:rPr>
-        <w:t xml:space="preserve">Crea un </w:t>
+        <w:t xml:space="preserve">"Crear cuenta" crea un usuario de Supabase con </w:t>
       </w:r>
       <w:r>
         <w:rPr>
@@ -1619,7 +1619,7 @@
           <w:sz w:val="22"/>
           <w:szCs w:val="22"/>
         </w:rPr>
-        <w:t xml:space="preserve">perfil de participante</w:t>
+        <w:t xml:space="preserve">correo y contraseña</w:t>
       </w:r>
       <w:r>
         <w:rPr>
@@ -1628,7 +1628,7 @@
           <w:sz w:val="22"/>
           <w:szCs w:val="22"/>
         </w:rPr>
-        <w:t xml:space="preserve">, no una cuenta con contraseña. Al tocar "Registrarme", Supabase abre una </w:t>
+        <w:t xml:space="preserve"> (Supabase guarda la contraseña cifrada; nadie del equipo puede verla) y el perfil queda ligado a su id: participantes.id = auth.uid(). Por eso la misma cuenta funciona en cualquier celular o computadora: basta con </w:t>
       </w:r>
       <w:r>
         <w:rPr>
@@ -1639,7 +1639,7 @@
           <w:sz w:val="22"/>
           <w:szCs w:val="22"/>
         </w:rPr>
-        <w:t xml:space="preserve">sesión anónima</w:t>
+        <w:t xml:space="preserve">Ingresar</w:t>
       </w:r>
       <w:r>
         <w:rPr>
@@ -1648,7 +1648,99 @@
           <w:sz w:val="22"/>
           <w:szCs w:val="22"/>
         </w:rPr>
-        <w:t xml:space="preserve"> en ese celular y navegador, y el perfil (nombre, alias, correo) queda ligado a ella. Así nadie tiene que recordar una contraseña para votar o inscribirse. La contracara: si la persona borra los datos del navegador o cambia de celular, pierde el acceso a su perfil y su correo queda ocupado hasta que un organizador lo elimine.</w:t>
+        <w:t xml:space="preserve">. Si olvida la contraseña, "¿Olvidaste tu contraseña?" le envía un enlace al correo (pantalla /restablecer).</w:t>
+      </w:r>
+    </w:p>
+    <w:p>
+      <w:pPr>
+        <w:spacing w:after="140" w:line="276"/>
+        <w:jc w:val="both"/>
+      </w:pPr>
+      <w:r>
+        <w:rPr>
+          <w:rFonts w:ascii="Montserrat" w:cs="Montserrat" w:eastAsia="Montserrat" w:hAnsi="Montserrat"/>
+          <w:b/>
+          <w:bCs/>
+          <w:color w:val="1A1A1A"/>
+          <w:sz w:val="22"/>
+          <w:szCs w:val="22"/>
+        </w:rPr>
+        <w:t xml:space="preserve">Registros antiguos:</w:t>
+      </w:r>
+      <w:r>
+        <w:rPr>
+          <w:rFonts w:ascii="Montserrat" w:cs="Montserrat" w:eastAsia="Montserrat" w:hAnsi="Montserrat"/>
+          <w:color w:val="1A1A1A"/>
+          <w:sz w:val="22"/>
+          <w:szCs w:val="22"/>
+        </w:rPr>
+        <w:t xml:space="preserve"> al principio el perfil se guardaba con una sesión anónima que solo vivía en un navegador. Esas personas ven en su perfil el recuadro </w:t>
+      </w:r>
+      <w:r>
+        <w:rPr>
+          <w:rFonts w:ascii="Montserrat" w:cs="Montserrat" w:eastAsia="Montserrat" w:hAnsi="Montserrat"/>
+          <w:b/>
+          <w:bCs/>
+          <w:color w:val="1A1A1A"/>
+          <w:sz w:val="22"/>
+          <w:szCs w:val="22"/>
+        </w:rPr>
+        <w:t xml:space="preserve">"Protege tu cuenta"</w:t>
+      </w:r>
+      <w:r>
+        <w:rPr>
+          <w:rFonts w:ascii="Montserrat" w:cs="Montserrat" w:eastAsia="Montserrat" w:hAnsi="Montserrat"/>
+          <w:color w:val="1A1A1A"/>
+          <w:sz w:val="22"/>
+          <w:szCs w:val="22"/>
+        </w:rPr>
+        <w:t xml:space="preserve">: al crear una contraseña, Supabase convierte su sesión en cuenta </w:t>
+      </w:r>
+      <w:r>
+        <w:rPr>
+          <w:rFonts w:ascii="Montserrat" w:cs="Montserrat" w:eastAsia="Montserrat" w:hAnsi="Montserrat"/>
+          <w:b/>
+          <w:bCs/>
+          <w:color w:val="1A1A1A"/>
+          <w:sz w:val="22"/>
+          <w:szCs w:val="22"/>
+        </w:rPr>
+        <w:t xml:space="preserve">conservando el mismo id</w:t>
+      </w:r>
+      <w:r>
+        <w:rPr>
+          <w:rFonts w:ascii="Montserrat" w:cs="Montserrat" w:eastAsia="Montserrat" w:hAnsi="Montserrat"/>
+          <w:color w:val="1A1A1A"/>
+          <w:sz w:val="22"/>
+          <w:szCs w:val="22"/>
+        </w:rPr>
+        <w:t xml:space="preserve">, así que no pierden votos ni inscripciones y no hizo falta migrar datos.</w:t>
+      </w:r>
+    </w:p>
+    <w:p>
+      <w:pPr>
+        <w:spacing w:after="140" w:line="276"/>
+        <w:jc w:val="both"/>
+      </w:pPr>
+      <w:r>
+        <w:rPr>
+          <w:rFonts w:ascii="Montserrat" w:cs="Montserrat" w:eastAsia="Montserrat" w:hAnsi="Montserrat"/>
+          <w:b/>
+          <w:bCs/>
+          <w:color w:val="1A1A1A"/>
+          <w:sz w:val="22"/>
+          <w:szCs w:val="22"/>
+        </w:rPr>
+        <w:t xml:space="preserve">Organizador y participante a la vez:</w:t>
+      </w:r>
+      <w:r>
+        <w:rPr>
+          <w:rFonts w:ascii="Montserrat" w:cs="Montserrat" w:eastAsia="Montserrat" w:hAnsi="Montserrat"/>
+          <w:color w:val="1A1A1A"/>
+          <w:sz w:val="22"/>
+          <w:szCs w:val="22"/>
+        </w:rPr>
+        <w:t xml:space="preserve"> una cuenta de organizador puede crear también su perfil de participante (en "Crear cuenta" se usa su correo y no pide contraseña). Así una sola cuenta sirve para el panel y para participar.</w:t>
       </w:r>
     </w:p>
     <w:p>
@@ -1663,27 +1755,7 @@
           <w:sz w:val="22"/>
           <w:szCs w:val="22"/>
         </w:rPr>
-        <w:t xml:space="preserve">Código: función </w:t>
-      </w:r>
-      <w:r>
-        <w:rPr>
-          <w:rFonts w:ascii="Montserrat" w:cs="Montserrat" w:eastAsia="Montserrat" w:hAnsi="Montserrat"/>
-          <w:b/>
-          <w:bCs/>
-          <w:color w:val="1A1A1A"/>
-          <w:sz w:val="22"/>
-          <w:szCs w:val="22"/>
-        </w:rPr>
-        <w:t xml:space="preserve">registrarParticipante</w:t>
-      </w:r>
-      <w:r>
-        <w:rPr>
-          <w:rFonts w:ascii="Montserrat" w:cs="Montserrat" w:eastAsia="Montserrat" w:hAnsi="Montserrat"/>
-          <w:color w:val="1A1A1A"/>
-          <w:sz w:val="22"/>
-          <w:szCs w:val="22"/>
-        </w:rPr>
-        <w:t xml:space="preserve"> en src/lib/api.ts y la pantalla src/pages/Registro.tsx.</w:t>
+        <w:t xml:space="preserve">Código: registrarParticipante, iniciarSesion y protegerCuenta en src/lib/api.ts; pantallas src/pages/Registro.tsx, Ingresar.tsx y Restablecer.tsx.</w:t>
       </w:r>
     </w:p>
     <w:p>
@@ -1828,16 +1900,16 @@
                 <w:sz w:val="22"/>
                 <w:szCs w:val="22"/>
               </w:rPr>
-              <w:t xml:space="preserve">Importante:</w:t>
-            </w:r>
-            <w:r>
-              <w:rPr>
-                <w:rFonts w:ascii="Montserrat" w:cs="Montserrat" w:eastAsia="Montserrat" w:hAnsi="Montserrat"/>
-                <w:color w:val="1A1A1A"/>
-                <w:sz w:val="22"/>
-                <w:szCs w:val="22"/>
-              </w:rPr>
-              <w:t xml:space="preserve"> usa otro navegador o una ventana privada para el panel. Si inicias sesión como organizador en el navegador donde te registraste como participante, ese registro de participante se pierde (solo puede haber una sesión por navegador).</w:t>
+              <w:t xml:space="preserve">Una sesión por navegador:</w:t>
+            </w:r>
+            <w:r>
+              <w:rPr>
+                <w:rFonts w:ascii="Montserrat" w:cs="Montserrat" w:eastAsia="Montserrat" w:hAnsi="Montserrat"/>
+                <w:color w:val="1A1A1A"/>
+                <w:sz w:val="22"/>
+                <w:szCs w:val="22"/>
+              </w:rPr>
+              <w:t xml:space="preserve"> si entras al panel en el navegador donde tenías abierta tu cuenta de participante, esa sesión se cierra. No se pierde nada: vuelves a entrar con Ingresar. Para la demo, igual conviene usar dos dispositivos.</w:t>
             </w:r>
           </w:p>
         </w:tc>
@@ -3161,7 +3233,7 @@
                 <w:sz w:val="22"/>
                 <w:szCs w:val="22"/>
               </w:rPr>
-              <w:t xml:space="preserve">Registro / perfil</w:t>
+              <w:t xml:space="preserve">Crear cuenta / perfil</w:t>
             </w:r>
           </w:p>
         </w:tc>
@@ -3193,7 +3265,7 @@
                 <w:sz w:val="22"/>
                 <w:szCs w:val="22"/>
               </w:rPr>
-              <w:t xml:space="preserve">Formulario con validación; después muestra tu perfil y "Borrar mis datos"</w:t>
+              <w:t xml:space="preserve">Formulario con validación y contraseña; después muestra tu perfil, "Protege tu cuenta" (registros antiguos), "Cerrar sesión" y "Borrar mis datos"</w:t>
             </w:r>
           </w:p>
         </w:tc>
@@ -3265,7 +3337,7 @@
                 <w:sz w:val="22"/>
                 <w:szCs w:val="22"/>
               </w:rPr>
-              <w:t xml:space="preserve">Privacidad</w:t>
+              <w:t xml:space="preserve">Ingresar / Restablecer</w:t>
             </w:r>
           </w:p>
         </w:tc>
@@ -3298,7 +3370,7 @@
                 <w:sz w:val="22"/>
                 <w:szCs w:val="22"/>
               </w:rPr>
-              <w:t xml:space="preserve">Qué datos se piden, para qué, quién los ve y cómo borrarlos (Ley 29733)</w:t>
+              <w:t xml:space="preserve">Entrar con correo y contraseña; "¿Olvidaste tu contraseña?" y la pantalla para crear una nueva</w:t>
             </w:r>
           </w:p>
         </w:tc>
@@ -3331,7 +3403,7 @@
                 <w:sz w:val="22"/>
                 <w:szCs w:val="22"/>
               </w:rPr>
-              <w:t xml:space="preserve">src/pages/Privacidad.tsx</w:t>
+              <w:t xml:space="preserve">src/pages/Ingresar.tsx, Restablecer.tsx</w:t>
             </w:r>
           </w:p>
         </w:tc>
@@ -3370,6 +3442,110 @@
                 <w:sz w:val="22"/>
                 <w:szCs w:val="22"/>
               </w:rPr>
+              <w:t xml:space="preserve">Privacidad</w:t>
+            </w:r>
+          </w:p>
+        </w:tc>
+        <w:tc>
+          <w:tcPr>
+            <w:tcW w:type="dxa" w:w="5059"/>
+            <w:tcBorders>
+              <w:top w:val="single" w:color="D0D0D0" w:sz="2"/>
+              <w:left w:val="single" w:color="D0D0D0" w:sz="2"/>
+              <w:bottom w:val="single" w:color="D0D0D0" w:sz="2"/>
+              <w:right w:val="single" w:color="D0D0D0" w:sz="2"/>
+            </w:tcBorders>
+            <w:tcMar>
+              <w:top w:type="dxa" w:w="70"/>
+              <w:left w:type="dxa" w:w="100"/>
+              <w:bottom w:type="dxa" w:w="70"/>
+              <w:right w:type="dxa" w:w="100"/>
+            </w:tcMar>
+            <w:vAlign w:val="center"/>
+          </w:tcPr>
+          <w:p>
+            <w:pPr>
+              <w:spacing w:after="0" w:line="252"/>
+            </w:pPr>
+            <w:r>
+              <w:rPr>
+                <w:rFonts w:ascii="Montserrat" w:cs="Montserrat" w:eastAsia="Montserrat" w:hAnsi="Montserrat"/>
+                <w:color w:val="1A1A1A"/>
+                <w:sz w:val="22"/>
+                <w:szCs w:val="22"/>
+              </w:rPr>
+              <w:t xml:space="preserve">Qué datos se piden, para qué, quién los ve y cómo borrarlos (Ley 29733)</w:t>
+            </w:r>
+          </w:p>
+        </w:tc>
+        <w:tc>
+          <w:tcPr>
+            <w:tcW w:type="dxa" w:w="2531"/>
+            <w:tcBorders>
+              <w:top w:val="single" w:color="D0D0D0" w:sz="2"/>
+              <w:left w:val="single" w:color="D0D0D0" w:sz="2"/>
+              <w:bottom w:val="single" w:color="D0D0D0" w:sz="2"/>
+              <w:right w:val="single" w:color="D0D0D0" w:sz="2"/>
+            </w:tcBorders>
+            <w:tcMar>
+              <w:top w:type="dxa" w:w="70"/>
+              <w:left w:type="dxa" w:w="100"/>
+              <w:bottom w:type="dxa" w:w="70"/>
+              <w:right w:type="dxa" w:w="100"/>
+            </w:tcMar>
+            <w:vAlign w:val="center"/>
+          </w:tcPr>
+          <w:p>
+            <w:pPr>
+              <w:spacing w:after="0" w:line="252"/>
+            </w:pPr>
+            <w:r>
+              <w:rPr>
+                <w:rFonts w:ascii="Montserrat" w:cs="Montserrat" w:eastAsia="Montserrat" w:hAnsi="Montserrat"/>
+                <w:color w:val="1A1A1A"/>
+                <w:sz w:val="22"/>
+                <w:szCs w:val="22"/>
+              </w:rPr>
+              <w:t xml:space="preserve">src/pages/Privacidad.tsx</w:t>
+            </w:r>
+          </w:p>
+        </w:tc>
+      </w:tr>
+      <w:tr>
+        <w:trPr>
+          <w:cantSplit/>
+        </w:trPr>
+        <w:tc>
+          <w:tcPr>
+            <w:tcW w:type="dxa" w:w="1770"/>
+            <w:tcBorders>
+              <w:top w:val="single" w:color="D0D0D0" w:sz="2"/>
+              <w:left w:val="single" w:color="D0D0D0" w:sz="2"/>
+              <w:bottom w:val="single" w:color="D0D0D0" w:sz="2"/>
+              <w:right w:val="single" w:color="D0D0D0" w:sz="2"/>
+            </w:tcBorders>
+            <w:shd w:fill="F2F2F2" w:color="auto" w:val="clear"/>
+            <w:tcMar>
+              <w:top w:type="dxa" w:w="70"/>
+              <w:left w:type="dxa" w:w="100"/>
+              <w:bottom w:type="dxa" w:w="70"/>
+              <w:right w:type="dxa" w:w="100"/>
+            </w:tcMar>
+            <w:vAlign w:val="center"/>
+          </w:tcPr>
+          <w:p>
+            <w:pPr>
+              <w:spacing w:after="0" w:line="252"/>
+            </w:pPr>
+            <w:r>
+              <w:rPr>
+                <w:rFonts w:ascii="Montserrat" w:cs="Montserrat" w:eastAsia="Montserrat" w:hAnsi="Montserrat"/>
+                <w:b/>
+                <w:bCs/>
+                <w:color w:val="1A1A1A"/>
+                <w:sz w:val="22"/>
+                <w:szCs w:val="22"/>
+              </w:rPr>
               <w:t xml:space="preserve">Resúmenes</w:t>
             </w:r>
           </w:p>
@@ -3383,6 +3559,7 @@
               <w:bottom w:val="single" w:color="D0D0D0" w:sz="2"/>
               <w:right w:val="single" w:color="D0D0D0" w:sz="2"/>
             </w:tcBorders>
+            <w:shd w:fill="F2F2F2" w:color="auto" w:val="clear"/>
             <w:tcMar>
               <w:top w:type="dxa" w:w="70"/>
               <w:left w:type="dxa" w:w="100"/>
@@ -3415,6 +3592,7 @@
               <w:bottom w:val="single" w:color="D0D0D0" w:sz="2"/>
               <w:right w:val="single" w:color="D0D0D0" w:sz="2"/>
             </w:tcBorders>
+            <w:shd w:fill="F2F2F2" w:color="auto" w:val="clear"/>
             <w:tcMar>
               <w:top w:type="dxa" w:w="70"/>
               <w:left w:type="dxa" w:w="100"/>
@@ -4311,7 +4489,7 @@
                 <w:sz w:val="22"/>
                 <w:szCs w:val="22"/>
               </w:rPr>
-              <w:t xml:space="preserve">Auth (sesión anónima o correo) · PostgreSQL con seguridad por filas (RLS) · funciones que validan reglas · Storage para fotos.</w:t>
+              <w:t xml:space="preserve">Auth (cuentas con correo y contraseña) · PostgreSQL con seguridad por filas (RLS) · funciones que validan reglas · Storage para fotos.</w:t>
             </w:r>
           </w:p>
         </w:tc>
@@ -5820,7 +5998,7 @@
           <w:sz w:val="22"/>
           <w:szCs w:val="22"/>
         </w:rPr>
-        <w:t xml:space="preserve">Archivos: supabase/migrations/0001_esquema.sql (tablas), 0002_rls_y_funciones.sql (seguridad, vistas, funciones), 0003_storage.sql (fotos) y supabase/seed.sql (datos ficticios).</w:t>
+        <w:t xml:space="preserve">Archivos: supabase/migrations/0001_esquema.sql (tablas), 0002_rls_y_funciones.sql (seguridad, vistas, funciones), 0003_storage.sql (fotos), 0004_cuentas.sql (borrar_mi_cuenta: borra perfil y cuenta) y supabase/seed.sql (datos ficticios).</w:t>
       </w:r>
     </w:p>
     <w:p>
@@ -7869,7 +8047,7 @@
           <w:sz w:val="22"/>
           <w:szCs w:val="22"/>
         </w:rPr>
-        <w:t xml:space="preserve">Celular (participante): abrir el enlace → Registrarme → votar en la encuesta.</w:t>
+        <w:t xml:space="preserve">Celular (participante): abrir el enlace → Crear cuenta → votar en la encuesta.</w:t>
       </w:r>
     </w:p>
     <w:p>
@@ -8004,7 +8182,7 @@
                 <w:sz w:val="22"/>
                 <w:szCs w:val="22"/>
               </w:rPr>
-              <w:t xml:space="preserve"> en el panel, devolver la actividad a "Inscripciones abiertas", quitar asistencias y puestos; en el celular, Perfil → Borrar mis datos. Así la base queda como en la semilla.</w:t>
+              <w:t xml:space="preserve"> en el panel, devolver la actividad a "Inscripciones abiertas", quitar asistencias y puestos; en el celular, Perfil → Borrar mis datos (con 0004_cuentas.sql también se borra la cuenta). Así la base queda como en la semilla.</w:t>
             </w:r>
           </w:p>
         </w:tc>
@@ -8224,7 +8402,7 @@
                 <w:sz w:val="22"/>
                 <w:szCs w:val="22"/>
               </w:rPr>
-              <w:t xml:space="preserve">"El registro sin contraseña está desactivado"</w:t>
+              <w:t xml:space="preserve">Al crear cuenta dice "Te enviamos un correo para confirmar"</w:t>
             </w:r>
           </w:p>
         </w:tc>
@@ -8257,7 +8435,7 @@
                 <w:sz w:val="22"/>
                 <w:szCs w:val="22"/>
               </w:rPr>
-              <w:t xml:space="preserve">En Supabase, Authentication → Sign In / Providers → activar Allow anonymous sign-ins</w:t>
+              <w:t xml:space="preserve">Está activado Confirm email en Supabase: desactivarlo en Authentication → Sign In / Providers → Email</w:t>
             </w:r>
           </w:p>
         </w:tc>
@@ -8294,7 +8472,7 @@
                 <w:sz w:val="22"/>
                 <w:szCs w:val="22"/>
               </w:rPr>
-              <w:t xml:space="preserve">No carga nada después de días sin uso</w:t>
+              <w:t xml:space="preserve">El enlace de "Olvidé mi contraseña" no llega o falla</w:t>
             </w:r>
           </w:p>
         </w:tc>
@@ -8326,7 +8504,7 @@
                 <w:sz w:val="22"/>
                 <w:szCs w:val="22"/>
               </w:rPr>
-              <w:t xml:space="preserve">El plan gratuito pausa el proyecto: entrar a Supabase y reanudarlo</w:t>
+              <w:t xml:space="preserve">Límite de correos del plan gratuito (esperar) o falta /restablecer en Authentication → URL Configuration → Redirect URLs</w:t>
             </w:r>
           </w:p>
         </w:tc>
@@ -8364,7 +8542,7 @@
                 <w:sz w:val="22"/>
                 <w:szCs w:val="22"/>
               </w:rPr>
-              <w:t xml:space="preserve">"Acceso solo para organizadores"</w:t>
+              <w:t xml:space="preserve">No carga nada después de días sin uso</w:t>
             </w:r>
           </w:p>
         </w:tc>
@@ -8397,7 +8575,7 @@
                 <w:sz w:val="22"/>
                 <w:szCs w:val="22"/>
               </w:rPr>
-              <w:t xml:space="preserve">La cuenta existe pero no está en la tabla organizadores (ver sección 3)</w:t>
+              <w:t xml:space="preserve">El plan gratuito pausa el proyecto: entrar a Supabase y reanudarlo</w:t>
             </w:r>
           </w:p>
         </w:tc>
@@ -8434,7 +8612,7 @@
                 <w:sz w:val="22"/>
                 <w:szCs w:val="22"/>
               </w:rPr>
-              <w:t xml:space="preserve">"Este correo ya está registrado"</w:t>
+              <w:t xml:space="preserve">"Acceso solo para organizadores"</w:t>
             </w:r>
           </w:p>
         </w:tc>
@@ -8466,7 +8644,7 @@
                 <w:sz w:val="22"/>
                 <w:szCs w:val="22"/>
               </w:rPr>
-              <w:t xml:space="preserve">Ese correo ya tiene perfil; usar el mismo navegador o pedir a un organizador que lo borre</w:t>
+              <w:t xml:space="preserve">La cuenta existe pero no está en la tabla organizadores (ver sección 3)</w:t>
             </w:r>
           </w:p>
         </w:tc>
@@ -8504,7 +8682,7 @@
                 <w:sz w:val="22"/>
                 <w:szCs w:val="22"/>
               </w:rPr>
-              <w:t xml:space="preserve">Al entrar al panel desapareció mi registro de participante</w:t>
+              <w:t xml:space="preserve">"Ya existe una cuenta con este correo"</w:t>
             </w:r>
           </w:p>
         </w:tc>
@@ -8537,7 +8715,7 @@
                 <w:sz w:val="22"/>
                 <w:szCs w:val="22"/>
               </w:rPr>
-              <w:t xml:space="preserve">Se usó el mismo navegador. Usar otro navegador o ventana privada</w:t>
+              <w:t xml:space="preserve">Esa persona ya tiene cuenta: debe usar Ingresar (o recuperar su contraseña)</w:t>
             </w:r>
           </w:p>
         </w:tc>
@@ -8574,6 +8752,76 @@
                 <w:sz w:val="22"/>
                 <w:szCs w:val="22"/>
               </w:rPr>
+              <w:t xml:space="preserve">Al entrar al panel se cerró mi cuenta de participante</w:t>
+            </w:r>
+          </w:p>
+        </w:tc>
+        <w:tc>
+          <w:tcPr>
+            <w:tcW w:type="dxa" w:w="5884"/>
+            <w:tcBorders>
+              <w:top w:val="single" w:color="D0D0D0" w:sz="2"/>
+              <w:left w:val="single" w:color="D0D0D0" w:sz="2"/>
+              <w:bottom w:val="single" w:color="D0D0D0" w:sz="2"/>
+              <w:right w:val="single" w:color="D0D0D0" w:sz="2"/>
+            </w:tcBorders>
+            <w:tcMar>
+              <w:top w:type="dxa" w:w="70"/>
+              <w:left w:type="dxa" w:w="100"/>
+              <w:bottom w:type="dxa" w:w="70"/>
+              <w:right w:type="dxa" w:w="100"/>
+            </w:tcMar>
+            <w:vAlign w:val="center"/>
+          </w:tcPr>
+          <w:p>
+            <w:pPr>
+              <w:spacing w:after="0" w:line="252"/>
+            </w:pPr>
+            <w:r>
+              <w:rPr>
+                <w:rFonts w:ascii="Montserrat" w:cs="Montserrat" w:eastAsia="Montserrat" w:hAnsi="Montserrat"/>
+                <w:color w:val="1A1A1A"/>
+                <w:sz w:val="22"/>
+                <w:szCs w:val="22"/>
+              </w:rPr>
+              <w:t xml:space="preserve">Un navegador tiene una sesión a la vez: volver a entrar con Ingresar</w:t>
+            </w:r>
+          </w:p>
+        </w:tc>
+      </w:tr>
+      <w:tr>
+        <w:trPr>
+          <w:cantSplit/>
+        </w:trPr>
+        <w:tc>
+          <w:tcPr>
+            <w:tcW w:type="dxa" w:w="3476"/>
+            <w:tcBorders>
+              <w:top w:val="single" w:color="D0D0D0" w:sz="2"/>
+              <w:left w:val="single" w:color="D0D0D0" w:sz="2"/>
+              <w:bottom w:val="single" w:color="D0D0D0" w:sz="2"/>
+              <w:right w:val="single" w:color="D0D0D0" w:sz="2"/>
+            </w:tcBorders>
+            <w:shd w:fill="F2F2F2" w:color="auto" w:val="clear"/>
+            <w:tcMar>
+              <w:top w:type="dxa" w:w="70"/>
+              <w:left w:type="dxa" w:w="100"/>
+              <w:bottom w:type="dxa" w:w="70"/>
+              <w:right w:type="dxa" w:w="100"/>
+            </w:tcMar>
+            <w:vAlign w:val="center"/>
+          </w:tcPr>
+          <w:p>
+            <w:pPr>
+              <w:spacing w:after="0" w:line="252"/>
+            </w:pPr>
+            <w:r>
+              <w:rPr>
+                <w:rFonts w:ascii="Montserrat" w:cs="Montserrat" w:eastAsia="Montserrat" w:hAnsi="Montserrat"/>
+                <w:color w:val="1A1A1A"/>
+                <w:sz w:val="22"/>
+                <w:szCs w:val="22"/>
+              </w:rPr>
               <w:t xml:space="preserve">Muchos no pueden registrarse en el laboratorio</w:t>
             </w:r>
           </w:p>
@@ -8587,6 +8835,7 @@
               <w:bottom w:val="single" w:color="D0D0D0" w:sz="2"/>
               <w:right w:val="single" w:color="D0D0D0" w:sz="2"/>
             </w:tcBorders>
+            <w:shd w:fill="F2F2F2" w:color="auto" w:val="clear"/>
             <w:tcMar>
               <w:top w:type="dxa" w:w="70"/>
               <w:left w:type="dxa" w:w="100"/>

</xml_diff>